<commit_message>
Updated site pages for clarity
</commit_message>
<xml_diff>
--- a/downloads/resources/faculty-composer-quick-start-guide.docx
+++ b/downloads/resources/faculty-composer-quick-start-guide.docx
@@ -64,7 +64,7 @@
         <w:spacing w:after="240"/>
       </w:pPr>
       <w:r>
-        <w:t>Build an economics Mastery Quest, publish its complete package, and place the game in Canvas.</w:t>
+        <w:t>Build an economics Mastery Quest, publish its self-contained game HTML, and place the game in Canvas.</w:t>
       </w:r>
     </w:p>
     <w:tbl>
@@ -91,7 +91,7 @@
           </w:tcPr>
           <w:p>
             <w:r>
-              <w:t>Fast path: Choose a course area and starter combination, enable the modes you want, review readiness, generate, and publish the game HTML with its concept-reviews folder. No JavaScript editing is required.</w:t>
+              <w:t>Fast path: Choose a course area and starter combination, enable the modes you want, review readiness, generate, and publish the self-contained game HTML. Concept Reviews open from the Mastery Quests web library when recommended. No JavaScript editing is required.</w:t>
             </w:r>
           </w:p>
         </w:tc>
@@ -428,7 +428,7 @@
             <w:r>
               <w:t>Generate</w:t>
               <w:br/>
-              <w:t>Download the ZIP. Keep the recipe and complete package if you may revise or republish the build later.</w:t>
+              <w:t>Download the ZIP. Keep the recipe and faculty build records if you may revise or republish the build later.</w:t>
             </w:r>
           </w:p>
         </w:tc>
@@ -502,7 +502,7 @@
         <w:pStyle w:val="ListBullet"/>
       </w:pPr>
       <w:r>
-        <w:t>concept-reviews/ - the runtime manifest and only the one-page reviews required by concepts this build can diagnose.</w:t>
+        <w:t>Concept Review routing is embedded in the generated game. Review PDFs remain in the Mastery Quests web library and are not copied into the ZIP.</w:t>
       </w:r>
     </w:p>
     <w:tbl>
@@ -529,7 +529,7 @@
           </w:tcPr>
           <w:p>
             <w:r>
-              <w:t>Publish the game HTML and its concept-reviews folder together. The recipe, composition manifest, and README are faculty records; the review folder is a runtime dependency when the report recommends a Concept Review.</w:t>
+              <w:t>Publish the generated game HTML. The recipe, composition manifest, and README are faculty records and do not need to be hosted. When the report recommends a Concept Review, the game opens the corresponding PDF from the Mastery Quests web library.</w:t>
             </w:r>
           </w:p>
         </w:tc>
@@ -597,7 +597,7 @@
             <w:r>
               <w:t>Extract the ZIP</w:t>
               <w:br/>
-              <w:t>Keep the generated HTML and concept-reviews folder together.</w:t>
+              <w:t>Locate the generated HTML file. The other ZIP files are faculty build records.</w:t>
             </w:r>
           </w:p>
         </w:tc>
@@ -699,9 +699,9 @@
           </w:tcPr>
           <w:p>
             <w:r>
-              <w:t>Upload the complete runtime package</w:t>
+              <w:t>Upload the game HTML</w:t>
               <w:br/>
-              <w:t>Place index.html and the concept-reviews folder at the publishing root. Preserve the folder name and contents.</w:t>
+              <w:t>Place index.html at the publishing root. No sibling Concept Review folder is required.</w:t>
             </w:r>
           </w:p>
         </w:tc>
@@ -866,7 +866,7 @@
           </w:tcPr>
           <w:p>
             <w:r>
-              <w:t>No separate Canvas wrapper file: the hosted index.html is the game, and its concept-reviews folder remains beside it on the host. The Canvas iframe displays the hosted game.</w:t>
+              <w:t>No separate Canvas wrapper file is required. The hosted index.html is the game, and the Canvas iframe displays that hosted file. Concept Reviews open from the Mastery Quests web library when recommended.</w:t>
             </w:r>
           </w:p>
         </w:tc>
@@ -1047,7 +1047,7 @@
         <w:pStyle w:val="ListBullet"/>
       </w:pPr>
       <w:r>
-        <w:t>When a meaningful weakness maps to a packaged review, open the recommended one-page Concept Review and confirm the student can return to practice.</w:t>
+        <w:t>When a meaningful weakness maps to an available review, open the recommended one-page Concept Review from the Mastery Quests web library and confirm the student can return to practice.</w:t>
       </w:r>
     </w:p>
     <w:p>

</xml_diff>

<commit_message>
Updating web site layout
</commit_message>
<xml_diff>
--- a/downloads/resources/faculty-composer-quick-start-guide.docx
+++ b/downloads/resources/faculty-composer-quick-start-guide.docx
@@ -55,7 +55,7 @@
         <w:spacing w:after="80"/>
       </w:pPr>
       <w:r>
-        <w:t>Composer + Canvas Quick Start</w:t>
+        <w:t>Composer + LMS Quick Start</w:t>
       </w:r>
     </w:p>
     <w:p>
@@ -64,7 +64,7 @@
         <w:spacing w:after="240"/>
       </w:pPr>
       <w:r>
-        <w:t>Build an economics Mastery Quest, publish its self-contained game HTML, and place the game in Canvas.</w:t>
+        <w:t>Build an economics Mastery Quest, publish its self-contained game HTML, and place the game in your LMS.</w:t>
       </w:r>
     </w:p>
     <w:tbl>
@@ -813,17 +813,16 @@
                 <w:sz w:val="22"/>
               </w:rPr>
               <w:t>Test the public URL</w:t>
+              <w:br/>
+              <w:t>Open the Pages URL in a private browser window and run the game before adding it to your LMS.</w:t>
             </w:r>
-            <w:r>
-              <w:br/>
-            </w:r>
+            <w:r/>
             <w:r>
               <w:rPr>
                 <w:rFonts w:ascii="Aptos" w:hAnsi="Aptos"/>
                 <w:color w:val="0A172A"/>
                 <w:sz w:val="20"/>
               </w:rPr>
-              <w:t>Open the Pages URL in a private browser window and run the game before putting it in Canvas.</w:t>
             </w:r>
           </w:p>
         </w:tc>
@@ -839,7 +838,7 @@
         <w:pStyle w:val="Heading1"/>
       </w:pPr>
       <w:r>
-        <w:t>3. Embed the game in Canvas</w:t>
+        <w:t>3. Add the game to your LMS</w:t>
       </w:r>
     </w:p>
     <w:tbl>
@@ -866,7 +865,7 @@
           </w:tcPr>
           <w:p>
             <w:r>
-              <w:t>No separate Canvas wrapper file is required. The hosted index.html is the game, and the Canvas iframe displays that hosted file. Concept Reviews open from the Mastery Quests web library when recommended.</w:t>
+              <w:t>The hosted index.html is the game. Add its public HTTPS URL to your LMS as an external link, or embed it if your LMS and institution permit external iframe content. No second wrapper file is required. Concept Reviews open from the Mastery Quests web library when recommended.</w:t>
             </w:r>
           </w:p>
         </w:tc>
@@ -916,7 +915,7 @@
           <w:color w:val="0A172A"/>
           <w:sz w:val="21"/>
         </w:rPr>
-        <w:t>Create or edit the Canvas page and switch to the HTML editor.</w:t>
+        <w:t>For a link, add the public GitHub Pages URL using your LMS's normal link or module tool. For an embed, open the LMS HTML/source editor if one is available.</w:t>
       </w:r>
     </w:p>
     <w:p>
@@ -931,7 +930,7 @@
           <w:color w:val="0A172A"/>
           <w:sz w:val="21"/>
         </w:rPr>
-        <w:t>Replace the example src with the public GitHub Pages game URL.</w:t>
+        <w:t>For an embed, replace the example src with the public GitHub Pages game URL.</w:t>
       </w:r>
     </w:p>
     <w:p>
@@ -946,7 +945,7 @@
           <w:color w:val="0A172A"/>
           <w:sz w:val="21"/>
         </w:rPr>
-        <w:t>Use 900 pixels as a starting height and increase it if your Canvas theme creates internal scrolling.</w:t>
+        <w:t>Use 900 pixels as a starting height and increase it if your LMS layout creates internal scrolling.</w:t>
       </w:r>
     </w:p>
     <w:p>
@@ -961,7 +960,15 @@
           <w:color w:val="0A172A"/>
           <w:sz w:val="21"/>
         </w:rPr>
-        <w:t>Save the Canvas page and verify the activity in Student View on desktop and mobile.</w:t>
+        <w:t>Save the LMS page and verify the activity in the learner/student view, when available, on desktop and mobile.</w:t>
+      </w:r>
+    </w:p>
+    <w:p>
+      <w:pPr>
+        <w:pStyle w:val="ListBullet"/>
+      </w:pPr>
+      <w:r>
+        <w:t>If the LMS or institution blocks external iframes, use the same public HTTPS URL as an external course link.</w:t>
       </w:r>
     </w:p>
     <w:p>

</xml_diff>

<commit_message>
Updated guides so they are consistent with the new build
</commit_message>
<xml_diff>
--- a/downloads/resources/faculty-composer-quick-start-guide.docx
+++ b/downloads/resources/faculty-composer-quick-start-guide.docx
@@ -91,7 +91,7 @@
           </w:tcPr>
           <w:p>
             <w:r>
-              <w:t>Fast path: Choose a course area and starter combination, enable the modes you want, review readiness, generate, and publish the self-contained game HTML. Concept Reviews open from the Mastery Quests web library when recommended. No JavaScript editing is required.</w:t>
+              <w:t>Fast path: Choose a course area and starter combination, enable the modes you want, choose an official theme or optional custom images, review Readiness, Generate, and publish the self-contained game HTML. Concept Reviews open from the Mastery Quests web library when recommended. No JavaScript editing is required.</w:t>
             </w:r>
           </w:p>
         </w:tc>
@@ -345,12 +345,21 @@
             </w:pPr>
             <w:r>
               <w:rPr>
-                <w:rFonts w:ascii="Aptos" w:hAnsi="Aptos"/>
                 <w:b/>
                 <w:color w:val="FFFFFF"/>
-                <w:sz w:val="24"/>
               </w:rPr>
               <w:t>05</w:t>
+            </w:r>
+            <w:r>
+              <w:rPr>
+                <w:color w:val="FFFFFF"/>
+              </w:rPr>
+              <w:br/>
+            </w:r>
+            <w:r>
+              <w:rPr>
+                <w:color w:val="FFFFFF"/>
+              </w:rPr>
             </w:r>
           </w:p>
         </w:tc>
@@ -369,23 +378,15 @@
             </w:pPr>
             <w:r>
               <w:rPr>
-                <w:rFonts w:ascii="Aptos" w:hAnsi="Aptos"/>
                 <w:b/>
-                <w:color w:val="062454"/>
-                <w:sz w:val="22"/>
               </w:rPr>
-              <w:t>Readiness</w:t>
+              <w:t>Appearance</w:t>
             </w:r>
             <w:r>
               <w:br/>
             </w:r>
             <w:r>
-              <w:rPr>
-                <w:rFonts w:ascii="Aptos" w:hAnsi="Aptos"/>
-                <w:color w:val="0A172A"/>
-                <w:sz w:val="20"/>
-              </w:rPr>
-              <w:t>Fix blocking coverage issues. Use the detailed pool counts only when you need the deeper audit.</w:t>
+              <w:t>Choose an official theme, keep its artwork, or replace individual slots with official or custom images.</w:t>
             </w:r>
           </w:p>
         </w:tc>
@@ -406,12 +407,83 @@
             </w:pPr>
             <w:r>
               <w:rPr>
-                <w:rFonts w:ascii="Aptos" w:hAnsi="Aptos"/>
                 <w:b/>
                 <w:color w:val="FFFFFF"/>
-                <w:sz w:val="24"/>
               </w:rPr>
               <w:t>06</w:t>
+            </w:r>
+            <w:r>
+              <w:rPr>
+                <w:color w:val="FFFFFF"/>
+              </w:rPr>
+              <w:br/>
+            </w:r>
+            <w:r>
+              <w:rPr>
+                <w:color w:val="FFFFFF"/>
+              </w:rPr>
+            </w:r>
+          </w:p>
+        </w:tc>
+        <w:tc>
+          <w:tcPr>
+            <w:tcW w:type="dxa" w:w="9000"/>
+            <w:vAlign w:val="top"/>
+            <w:shd w:fill="FFFFFF"/>
+            <w:tcBorders>
+              <w:bottom w:val="single" w:sz="6" w:color="DDE5EC"/>
+            </w:tcBorders>
+          </w:tcPr>
+          <w:p>
+            <w:pPr>
+              <w:spacing w:after="80"/>
+            </w:pPr>
+            <w:r>
+              <w:rPr>
+                <w:b/>
+              </w:rPr>
+              <w:t>Readiness</w:t>
+            </w:r>
+            <w:r>
+              <w:br/>
+            </w:r>
+            <w:r>
+              <w:t>Fix blocking coverage issues. The Composer also shows the estimated package size.</w:t>
+            </w:r>
+          </w:p>
+        </w:tc>
+      </w:tr>
+      <w:tr>
+        <w:tc>
+          <w:tcPr>
+            <w:tcW w:type="dxa" w:w="792"/>
+            <w:vAlign w:val="top"/>
+            <w:shd w:fill="062454"/>
+            <w:tcBorders>
+              <w:bottom w:val="single" w:sz="6" w:color="DDE5EC"/>
+            </w:tcBorders>
+          </w:tcPr>
+          <w:p>
+            <w:pPr>
+              <w:jc w:val="center"/>
+            </w:pPr>
+            <w:r>
+              <w:rPr>
+                <w:b/>
+                <w:color w:val="FFFFFF"/>
+              </w:rPr>
+              <w:t>07</w:t>
+            </w:r>
+            <w:r>
+              <w:rPr>
+                <w:color w:val="FFFFFF"/>
+              </w:rPr>
+              <w:br/>
+            </w:r>
+            <w:r>
+              <w:rPr>
+                <w:color w:val="FFFFFF"/>
+              </w:rPr>
             </w:r>
           </w:p>
         </w:tc>
@@ -426,9 +498,16 @@
           </w:tcPr>
           <w:p>
             <w:r>
+              <w:rPr>
+                <w:b/>
+              </w:rPr>
               <w:t>Generate</w:t>
+            </w:r>
+            <w:r>
               <w:br/>
-              <w:t>Download the ZIP. Keep the recipe and faculty build records if you may revise or republish the build later.</w:t>
+            </w:r>
+            <w:r>
+              <w:t>Download the ZIP. Keep the composition recipe and faculty build records for later revisions.</w:t>
             </w:r>
           </w:p>
         </w:tc>
@@ -454,7 +533,7 @@
         <w:ind w:left="360" w:hanging="173"/>
       </w:pPr>
       <w:r>
-        <w:t>The generated .html file - the game; graph images and runtime logic are embedded.</w:t>
+        <w:t>The generated .html file - the game; graph images, selected official or custom artwork, and runtime logic are embedded.</w:t>
       </w:r>
     </w:p>
     <w:p>
@@ -974,6 +1053,7 @@
     <w:p>
       <w:pPr>
         <w:pStyle w:val="Heading2"/>
+        <w:pageBreakBefore/>
       </w:pPr>
       <w:r>
         <w:t>Before you assign it</w:t>
@@ -1047,6 +1127,16 @@
       </w:pPr>
       <w:r>
         <w:t>Check graphs, mobile layout, result screens, Mastery Report 2.0, and any evidence students must submit.</w:t>
+      </w:r>
+    </w:p>
+    <w:p>
+      <w:pPr>
+        <w:pStyle w:val="ListBullet"/>
+        <w:spacing w:after="50"/>
+        <w:ind w:left="360" w:hanging="173"/>
+      </w:pPr>
+      <w:r>
+        <w:t>Confirm the selected artwork is recognizable, gameplay text remains readable, and Guide, hallway, Boss, Artifact, and mode images appear where configured.</w:t>
       </w:r>
     </w:p>
     <w:p>

</xml_diff>